<commit_message>
Website-Bewertung: behandelte Zone in E-Mail (für Karussell); Datenschutz-Entwurf angepasst
Co-Authored-By: Claude Opus 5.5 <noreply@anthropic.com>
</commit_message>
<xml_diff>
--- a/_entwuerfe/Datenschutz-Bewertungsseite-Entwurf.docx
+++ b/_entwuerfe/Datenschutz-Bewertungsseite-Entwurf.docx
@@ -219,7 +219,7 @@
         <w:t xml:space="preserve">Veröffentlichung auf der Website: </w:t>
       </w:r>
       <w:r>
-        <w:t xml:space="preserve">Per E-Mail an info@haarfrei-trier.de gehen Sternebewertung, Anzeigename (Vorname + Initial), Text und Datum. Pflicht-Checkbox: „Ich bin einverstanden, dass meine Bewertung mit diesem Anzeigenamen auf haarfrei-trier.de veröffentlicht wird. Ich kann das jederzeit per E-Mail widerrufen.“ Die E-Mail-Adresse der Person wird nicht erfasst.</w:t>
+        <w:t xml:space="preserve">Per E-Mail an info@haarfrei-trier.de gehen Sternebewertung, Anzeigename (Vorname + Initial), behandelte Körperzone (sofern bei Frage 1 angegeben, z. B. „Achseln, Beine“), Text und Datum. Die Zone wird bei veröffentlichten Bewertungen unter dem Namen angezeigt. Pflicht-Checkbox: „Ich bin einverstanden, dass meine Bewertung mit diesem Anzeigenamen auf haarfrei-trier.de veröffentlicht wird. Ich kann das jederzeit per E-Mail widerrufen.“ Die E-Mail-Adresse der Person wird nicht erfasst.</w:t>
       </w:r>
     </w:p>
     <w:p>
@@ -547,7 +547,7 @@
         <w:spacing w:after="140" w:line="300"/>
       </w:pPr>
       <w:r>
-        <w:t xml:space="preserve">Wenn Sie Ihre Bewertung stattdessen auf unserer Website veröffentlichen möchten, senden wir Ihre Sternebewertung, Ihren Anzeigenamen (Vorname und Initial des Nachnamens), den Text und das Datum per E-Mail an info@haarfrei-trier.de. Dort prüfen wir die Bewertung und schalten sie von Hand frei. Rechtsgrundlage ist Ihre Einwilligung nach Art. 6 Abs. 1 lit. a DSGVO. Die E-Mail bewahren wir auf, solange die Bewertung veröffentlicht ist.</w:t>
+        <w:t xml:space="preserve">Wenn Sie Ihre Bewertung stattdessen auf unserer Website veröffentlichen möchten, senden wir Ihre Sternebewertung, Ihren Anzeigenamen (Vorname und Initial des Nachnamens), die behandelte Körperzone (sofern angegeben), den Text und das Datum per E-Mail an info@haarfrei-trier.de. Dort prüfen wir die Bewertung und schalten sie von Hand frei. Rechtsgrundlage ist Ihre Einwilligung nach Art. 6 Abs. 1 lit. a DSGVO. Die E-Mail bewahren wir auf, solange die Bewertung veröffentlicht ist.</w:t>
       </w:r>
     </w:p>
     <w:p>

</xml_diff>

<commit_message>
Datenschutz-Entwurf: geklärte Punkte (SCC, DPA, 30 Tage), KI-Einwilligung per Checkbox
Co-Authored-By: Claude Opus 5.5 <noreply@anthropic.com>
</commit_message>
<xml_diff>
--- a/_entwuerfe/Datenschutz-Bewertungsseite-Entwurf.docx
+++ b/_entwuerfe/Datenschutz-Bewertungsseite-Entwurf.docx
@@ -18,7 +18,7 @@
         <w:rPr>
           <w:color w:val="4E7878"/>
         </w:rPr>
-        <w:t xml:space="preserve">Entwurf zur rechtlichen Prüfung · Haarfrei-Trier · Stand: 27.09.2026</w:t>
+        <w:t xml:space="preserve">Entwurf zur rechtlichen Prüfung · Haarfrei-Trier · Stand: 30.09.2026 (überarbeitet)</w:t>
       </w:r>
     </w:p>
     <w:p>
@@ -54,7 +54,7 @@
         <w:spacing w:after="140" w:line="300"/>
       </w:pPr>
       <w:r>
-        <w:t xml:space="preserve">Unter haarfrei-trier.de/bewertung/ gibt es eine neue Seite, die Kundinnen und Kunden beim Schreiben einer Bewertung unterstützt. Den Zugang zur Seite erhalten sie persönlich im Studio nach ihrer 4. Behandlung. Die Seite ist nicht verlinkt und für Suchmaschinen gesperrt (noindex).</w:t>
+        <w:t xml:space="preserve">Unter haarfrei-trier.de/bewertung/ gibt es eine neue Seite, die Kundinnen und Kunden beim Schreiben einer Bewertung unterstützt. Den Zugang zur Seite erhalten sie persönlich im Studio nach ihrer 3. Behandlung. Die Seite ist nicht verlinkt und für Suchmaschinen gesperrt (noindex).</w:t>
       </w:r>
     </w:p>
     <w:p>
@@ -296,14 +296,64 @@
           <w:b/>
           <w:bCs/>
         </w:rPr>
-        <w:t xml:space="preserve">Kurzhinweis auf der Seite (aktueller Wortlaut): </w:t>
+        <w:t xml:space="preserve">Einwilligung zur KI (neu): </w:t>
+      </w:r>
+      <w:r>
+        <w:t xml:space="preserve">Vor „Text erstellen“ gibt es eine Checkbox (nicht vorausgewählt): </w:t>
       </w:r>
       <w:r>
         <w:rPr>
           <w:i/>
           <w:iCs/>
         </w:rPr>
-        <w:t xml:space="preserve">„Zur Formulierung des Textvorschlags werden Ihre Antworten an den KI-Dienst Anthropic (USA) übermittelt. Wir speichern Ihre Antworten nicht. Mehr dazu in unserer Datenschutzerklärung.“</w:t>
+        <w:t xml:space="preserve">„Textvorschlag mit KI formulieren lassen. Ich bin einverstanden, dass meine Antworten dafür an den KI-Dienst Anthropic (USA) übermittelt werden. Mehr in der Datenschutzerklärung.“</w:t>
+      </w:r>
+      <w:r>
+        <w:t xml:space="preserve"> Darunter: „Freiwillig. Ohne Häkchen setzen wir den Text direkt aus Ihren Antworten zusammen, ohne KI.“ Ohne Häkchen findet keine Übermittlung an Anthropic statt; auch der Server lehnt Anfragen ohne Einwilligung ab. Die Einwilligung kann auf der Ergebnisseite nachträglich erteilt werden.</w:t>
+      </w:r>
+    </w:p>
+    <w:p>
+      <w:pPr>
+        <w:pStyle w:val="ListParagraph"/>
+        <w:numPr>
+          <w:ilvl w:val="0"/>
+          <w:numId w:val="3"/>
+        </w:numPr>
+        <w:spacing w:after="90" w:line="290"/>
+      </w:pPr>
+      <w:r>
+        <w:rPr>
+          <w:b/>
+          <w:bCs/>
+        </w:rPr>
+        <w:t xml:space="preserve">Hinweis Gesundheitsdaten (neu): </w:t>
+      </w:r>
+      <w:r>
+        <w:t xml:space="preserve">Auf der Startseite der Strecke: „Bitte machen Sie in Ihren Antworten keine Angaben zu Erkrankungen, Medikamenten oder anderen Gesundheitsdaten.“</w:t>
+      </w:r>
+    </w:p>
+    <w:p>
+      <w:pPr>
+        <w:pStyle w:val="ListParagraph"/>
+        <w:numPr>
+          <w:ilvl w:val="0"/>
+          <w:numId w:val="3"/>
+        </w:numPr>
+        <w:spacing w:after="90" w:line="290"/>
+      </w:pPr>
+      <w:r>
+        <w:rPr>
+          <w:b/>
+          <w:bCs/>
+        </w:rPr>
+        <w:t xml:space="preserve">Kurzhinweis unten auf der Seite (aktueller Wortlaut): </w:t>
+      </w:r>
+      <w:r>
+        <w:rPr>
+          <w:i/>
+          <w:iCs/>
+        </w:rPr>
+        <w:t xml:space="preserve">„Nur wenn Sie zustimmen, werden Ihre Antworten zur Formulierung des Textvorschlags an den KI-Dienst Anthropic (USA) übermittelt. Wir speichern Ihre Antworten nicht. Mehr dazu in unserer Datenschutzerklärung.“</w:t>
       </w:r>
     </w:p>
     <w:p>
@@ -311,7 +361,75 @@
         <w:pStyle w:val="Heading2"/>
       </w:pPr>
       <w:r>
-        <w:t xml:space="preserve">3. Offene Prüfpunkte</w:t>
+        <w:t xml:space="preserve">3. Bereits geklärte Punkte (laut Anthropic Privacy Center, Stand 30.09.2026)</w:t>
+      </w:r>
+    </w:p>
+    <w:p>
+      <w:pPr>
+        <w:pStyle w:val="ListParagraph"/>
+        <w:numPr>
+          <w:ilvl w:val="0"/>
+          <w:numId w:val="3"/>
+        </w:numPr>
+        <w:spacing w:after="90" w:line="290"/>
+      </w:pPr>
+      <w:r>
+        <w:rPr>
+          <w:b/>
+          <w:bCs/>
+        </w:rPr>
+        <w:t xml:space="preserve">Drittlandübermittlung: </w:t>
+      </w:r>
+      <w:r>
+        <w:t xml:space="preserve">Anthropic ist nicht unter dem EU-US Data Privacy Framework zertifiziert. Die Übermittlung stützt sich auf EU-Standardvertragsklauseln (Module 2 und 3), die im Data Processing Addendum enthalten sind.</w:t>
+      </w:r>
+    </w:p>
+    <w:p>
+      <w:pPr>
+        <w:pStyle w:val="ListParagraph"/>
+        <w:numPr>
+          <w:ilvl w:val="0"/>
+          <w:numId w:val="3"/>
+        </w:numPr>
+        <w:spacing w:after="90" w:line="290"/>
+      </w:pPr>
+      <w:r>
+        <w:rPr>
+          <w:b/>
+          <w:bCs/>
+        </w:rPr>
+        <w:t xml:space="preserve">Auftragsverarbeitung: </w:t>
+      </w:r>
+      <w:r>
+        <w:t xml:space="preserve">Das Data Processing Addendum (inkl. Standardvertragsklauseln) ist automatisch Bestandteil der Commercial Terms of Service von Anthropic, die mit dem API-Konto akzeptiert wurden. Eine gesonderte Unterschrift ist nicht erforderlich.</w:t>
+      </w:r>
+    </w:p>
+    <w:p>
+      <w:pPr>
+        <w:pStyle w:val="ListParagraph"/>
+        <w:numPr>
+          <w:ilvl w:val="0"/>
+          <w:numId w:val="3"/>
+        </w:numPr>
+        <w:spacing w:after="90" w:line="290"/>
+      </w:pPr>
+      <w:r>
+        <w:rPr>
+          <w:b/>
+          <w:bCs/>
+        </w:rPr>
+        <w:t xml:space="preserve">Speicherfrist bei Anthropic: </w:t>
+      </w:r>
+      <w:r>
+        <w:t xml:space="preserve">API-Eingaben und -Ausgaben werden laut Anthropic innerhalb von 30 Tagen automatisch gelöscht (Ausnahmen: Missbrauchsverdacht, gesetzliche Pflichten).</w:t>
+      </w:r>
+    </w:p>
+    <w:p>
+      <w:pPr>
+        <w:pStyle w:val="Heading2"/>
+      </w:pPr>
+      <w:r>
+        <w:t xml:space="preserve">4. Offene Prüfpunkte</w:t>
       </w:r>
     </w:p>
     <w:p>
@@ -328,10 +446,10 @@
           <w:highlight w:val="yellow"/>
           <w:highlightCs w:val="yellow"/>
         </w:rPr>
-        <w:t xml:space="preserve">Drittlandübermittlung USA: </w:t>
-      </w:r>
-      <w:r>
-        <w:t xml:space="preserve">Ist Anthropic unter dem EU-US Data Privacy Framework zertifiziert, oder stützt sich die Übermittlung auf EU-Standardvertragsklauseln?</w:t>
+        <w:t xml:space="preserve">Einwilligung: </w:t>
+      </w:r>
+      <w:r>
+        <w:t xml:space="preserve">Ist die Checkbox vor „Text erstellen“ (siehe oben) als Einwilligung nach Art. 6 Abs. 1 lit. a DSGVO und für die Drittlandübermittlung ausreichend und richtig formuliert?</w:t>
       </w:r>
     </w:p>
     <w:p>
@@ -348,10 +466,10 @@
           <w:highlight w:val="yellow"/>
           <w:highlightCs w:val="yellow"/>
         </w:rPr>
-        <w:t xml:space="preserve">Auftragsverarbeitung: </w:t>
-      </w:r>
-      <w:r>
-        <w:t xml:space="preserve">Anthropic stellt für die API-Nutzung ein Data Processing Addendum bereit. Reicht dieses, und muss es aktiv abgeschlossen werden?</w:t>
+        <w:t xml:space="preserve">Gesundheitsdaten: </w:t>
+      </w:r>
+      <w:r>
+        <w:t xml:space="preserve">Trotz Hinweis könnten Antworten Gesundheitsangaben enthalten (z. B. Hautreizungen – dieses Beispiel nennt sogar der Hinweistext bei Frage 2 „Was hat Sie vorher gestört?“). Reicht der Hinweis, oder ist eine ausdrückliche Einwilligung nach Art. 9 Abs. 2 lit. a DSGVO bzw. eine Anpassung der Frage nötig?</w:t>
       </w:r>
     </w:p>
     <w:p>
@@ -368,66 +486,6 @@
           <w:highlight w:val="yellow"/>
           <w:highlightCs w:val="yellow"/>
         </w:rPr>
-        <w:t xml:space="preserve">Speicherfrist und Training bei Anthropic: </w:t>
-      </w:r>
-      <w:r>
-        <w:t xml:space="preserve">Laut Anthropic werden API-Daten nicht zum Training genutzt und nur begrenzt gespeichert. Welche Frist gilt aktuell?</w:t>
-      </w:r>
-    </w:p>
-    <w:p>
-      <w:pPr>
-        <w:pStyle w:val="ListParagraph"/>
-        <w:numPr>
-          <w:ilvl w:val="0"/>
-          <w:numId w:val="2"/>
-        </w:numPr>
-        <w:spacing w:after="90" w:line="290"/>
-      </w:pPr>
-      <w:r>
-        <w:rPr>
-          <w:highlight w:val="yellow"/>
-          <w:highlightCs w:val="yellow"/>
-        </w:rPr>
-        <w:t xml:space="preserve">Rechtsgrundlage: </w:t>
-      </w:r>
-      <w:r>
-        <w:t xml:space="preserve">Reicht der Kurzhinweis auf der Seite als Einwilligung (Art. 6 Abs. 1 lit. a DSGVO), oder braucht es vor „Text erstellen“ eine ausdrückliche Checkbox? Alternativ: berechtigtes Interesse (lit. f)?</w:t>
-      </w:r>
-    </w:p>
-    <w:p>
-      <w:pPr>
-        <w:pStyle w:val="ListParagraph"/>
-        <w:numPr>
-          <w:ilvl w:val="0"/>
-          <w:numId w:val="2"/>
-        </w:numPr>
-        <w:spacing w:after="90" w:line="290"/>
-      </w:pPr>
-      <w:r>
-        <w:rPr>
-          <w:highlight w:val="yellow"/>
-          <w:highlightCs w:val="yellow"/>
-        </w:rPr>
-        <w:t xml:space="preserve">Gesundheitsdaten: </w:t>
-      </w:r>
-      <w:r>
-        <w:t xml:space="preserve">Da es um Behandlungen geht, könnten Antworten Gesundheitsangaben enthalten (z. B. Hautprobleme, hormonelle Ursachen). Ist dafür eine ausdrückliche Einwilligung nach Art. 9 Abs. 2 lit. a DSGVO nötig, oder genügt ein Hinweis, solche Angaben nicht zu machen?</w:t>
-      </w:r>
-    </w:p>
-    <w:p>
-      <w:pPr>
-        <w:pStyle w:val="ListParagraph"/>
-        <w:numPr>
-          <w:ilvl w:val="0"/>
-          <w:numId w:val="2"/>
-        </w:numPr>
-        <w:spacing w:after="90" w:line="290"/>
-      </w:pPr>
-      <w:r>
-        <w:rPr>
-          <w:highlight w:val="yellow"/>
-          <w:highlightCs w:val="yellow"/>
-        </w:rPr>
         <w:t xml:space="preserve">Aufbewahrung der E-Mails: </w:t>
       </w:r>
       <w:r>
@@ -439,7 +497,7 @@
         <w:pStyle w:val="Heading2"/>
       </w:pPr>
       <w:r>
-        <w:t xml:space="preserve">4. Textentwurf für die Datenschutzerklärung</w:t>
+        <w:t xml:space="preserve">5. Textentwurf für die Datenschutzerklärung</w:t>
       </w:r>
     </w:p>
     <w:p>
@@ -455,7 +513,7 @@
         <w:spacing w:after="140" w:line="300"/>
       </w:pPr>
       <w:r>
-        <w:t xml:space="preserve">Kundinnen und Kunden erhalten nach ihrer 4. Behandlung persönlich im Studio Zugang zu unserer Bewertungsseite. Dort können Sie freiwillig einige Fragen zu Ihrer Behandlung beantworten. Wir helfen Ihnen dann dabei, daraus einen Bewertungstext zu formulieren.</w:t>
+        <w:t xml:space="preserve">Kundinnen und Kunden erhalten nach ihrer 3. Behandlung persönlich im Studio Zugang zu unserer Bewertungsseite. Dort können Sie freiwillig einige Fragen zu Ihrer Behandlung beantworten. Wir helfen Ihnen dann dabei, daraus einen Bewertungstext zu formulieren.</w:t>
       </w:r>
     </w:p>
     <w:p>
@@ -471,35 +529,15 @@
         <w:spacing w:after="140" w:line="300"/>
       </w:pPr>
       <w:r>
-        <w:t xml:space="preserve">Wenn Sie sich einen Textvorschlag erstellen lassen, übermitteln wir Ihre Antworten an die Anthropic PBC, 548 Market Street, PMB 90375, San Francisco, CA 94104, USA. Anthropic erstellt daraus mit einem KI-Sprachmodell einen Vorschlag. Übermittelt werden nur die Antworten, die Sie eingeben, und die technisch notwendigen Verbindungsdaten. Name, E-Mail-Adresse oder andere Kontaktdaten fragen wir dafür nicht ab. Bitte geben Sie in Ihren Antworten keine Gesundheitsdaten oder anderen sensiblen Angaben ein, die Sie nicht teilen möchten.</w:t>
-      </w:r>
-    </w:p>
-    <w:p>
-      <w:pPr>
-        <w:spacing w:after="140" w:line="300"/>
-      </w:pPr>
-      <w:r>
-        <w:t xml:space="preserve">Rechtsgrundlage ist Ihre Einwilligung nach Art. 6 Abs. 1 lit. a DSGVO, die Sie mit der Nutzung der Funktion erteilen. Die Übermittlung in die USA stützt sich auf </w:t>
-      </w:r>
-      <w:r>
-        <w:rPr>
-          <w:highlight w:val="yellow"/>
-          <w:highlightCs w:val="yellow"/>
-        </w:rPr>
-        <w:t xml:space="preserve">[den Angemessenheitsbeschluss der EU-Kommission (EU-US Data Privacy Framework), sofern Anthropic zertifiziert ist / die EU-Standardvertragsklauseln – BITTE PRÜFEN]</w:t>
-      </w:r>
-      <w:r>
-        <w:t xml:space="preserve">. Laut Anthropic werden über die API übermittelte Daten nicht zum Training von KI-Modellen verwendet und nur für begrenzte Zeit gespeichert </w:t>
-      </w:r>
-      <w:r>
-        <w:rPr>
-          <w:highlight w:val="yellow"/>
-          <w:highlightCs w:val="yellow"/>
-        </w:rPr>
-        <w:t xml:space="preserve">[Frist laut aktuellen Anthropic-Bedingungen prüfen]</w:t>
-      </w:r>
-      <w:r>
-        <w:t xml:space="preserve">.</w:t>
+        <w:t xml:space="preserve">Wenn Sie sich einen Textvorschlag mit KI erstellen lassen, übermitteln wir Ihre Antworten an die Anthropic PBC, 548 Market Street, PMB 90375, San Francisco, CA 94104, USA. Anthropic erstellt daraus mit einem KI-Sprachmodell einen Vorschlag. Übermittelt werden nur die Antworten, die Sie eingeben, und die technisch notwendigen Verbindungsdaten. Name, E-Mail-Adresse oder andere Kontaktdaten fragen wir dafür nicht ab. Bitte geben Sie in Ihren Antworten keine Gesundheitsdaten oder anderen sensiblen Angaben ein, die Sie nicht teilen möchten.</w:t>
+      </w:r>
+    </w:p>
+    <w:p>
+      <w:pPr>
+        <w:spacing w:after="140" w:line="300"/>
+      </w:pPr>
+      <w:r>
+        <w:t xml:space="preserve">Die Übermittlung erfolgt nur, wenn Sie vor dem Erstellen des Textes das entsprechende Kästchen anhaken. Rechtsgrundlage ist Ihre Einwilligung nach Art. 6 Abs. 1 lit. a DSGVO. Ohne Einwilligung setzen wir den Text direkt aus Ihren Antworten zusammen, ohne KI. Die Übermittlung in die USA stützt sich auf die EU-Standardvertragsklauseln, die Bestandteil unseres Auftragsverarbeitungsvertrags mit Anthropic sind. Laut Anthropic werden die übermittelten Daten innerhalb von 30 Tagen automatisch gelöscht.</w:t>
       </w:r>
     </w:p>
     <w:p>

</xml_diff>